<commit_message>
Added SIAOD sem5-6 and lab1
</commit_message>
<xml_diff>
--- a/DevOps/Overlab2/overlab2.docx
+++ b/DevOps/Overlab2/overlab2.docx
@@ -325,7 +325,6 @@
         </w:rPr>
         <w:t xml:space="preserve">сервиса на </w:t>
       </w:r>
-      <w:proofErr w:type="spellStart"/>
       <w:r>
         <w:rPr>
           <w:rFonts w:ascii="Times New Roman" w:eastAsia="Calibri" w:hAnsi="Times New Roman" w:cs="Times New Roman"/>
@@ -335,7 +334,6 @@
         </w:rPr>
         <w:t>gitlab</w:t>
       </w:r>
-      <w:proofErr w:type="spellEnd"/>
       <w:r>
         <w:rPr>
           <w:rFonts w:ascii="Times New Roman" w:eastAsia="Calibri" w:hAnsi="Times New Roman" w:cs="Times New Roman"/>
@@ -416,24 +414,24 @@
           <w:szCs w:val="24"/>
         </w:rPr>
       </w:pPr>
-      <w:proofErr w:type="spellStart"/>
       <w:r>
         <w:rPr>
           <w:rFonts w:ascii="Times New Roman" w:eastAsia="Calibri" w:hAnsi="Times New Roman" w:cs="Times New Roman"/>
           <w:sz w:val="24"/>
           <w:szCs w:val="24"/>
         </w:rPr>
-        <w:t>Аралушкин</w:t>
-      </w:r>
-      <w:proofErr w:type="spellEnd"/>
-      <w:r>
+        <w:t>Аралушкин Максим Дмитриевич</w:t>
+      </w:r>
+    </w:p>
+    <w:p>
+      <w:pPr>
+        <w:jc w:val="right"/>
         <w:rPr>
           <w:rFonts w:ascii="Times New Roman" w:eastAsia="Calibri" w:hAnsi="Times New Roman" w:cs="Times New Roman"/>
           <w:sz w:val="24"/>
           <w:szCs w:val="24"/>
         </w:rPr>
-        <w:t xml:space="preserve"> Максим Дмитриевич</w:t>
-      </w:r>
+      </w:pPr>
     </w:p>
     <w:p>
       <w:pPr>
@@ -444,24 +442,24 @@
           <w:szCs w:val="24"/>
         </w:rPr>
       </w:pPr>
-    </w:p>
-    <w:p>
-      <w:pPr>
-        <w:jc w:val="right"/>
+      <w:r>
         <w:rPr>
           <w:rFonts w:ascii="Times New Roman" w:eastAsia="Calibri" w:hAnsi="Times New Roman" w:cs="Times New Roman"/>
           <w:sz w:val="24"/>
           <w:szCs w:val="24"/>
         </w:rPr>
-      </w:pPr>
-      <w:r>
+        <w:t>Проверил: Тимчук А.В.</w:t>
+      </w:r>
+    </w:p>
+    <w:p>
+      <w:pPr>
+        <w:jc w:val="right"/>
         <w:rPr>
           <w:rFonts w:ascii="Times New Roman" w:eastAsia="Calibri" w:hAnsi="Times New Roman" w:cs="Times New Roman"/>
           <w:sz w:val="24"/>
           <w:szCs w:val="24"/>
         </w:rPr>
-        <w:t>Проверил: Тимчук А.В.</w:t>
-      </w:r>
+      </w:pPr>
     </w:p>
     <w:p>
       <w:pPr>
@@ -495,7 +493,6 @@
     </w:p>
     <w:p>
       <w:pPr>
-        <w:jc w:val="right"/>
         <w:rPr>
           <w:rFonts w:ascii="Times New Roman" w:eastAsia="Calibri" w:hAnsi="Times New Roman" w:cs="Times New Roman"/>
           <w:sz w:val="24"/>
@@ -505,36 +502,27 @@
     </w:p>
     <w:p>
       <w:pPr>
+        <w:jc w:val="center"/>
         <w:rPr>
           <w:rFonts w:ascii="Times New Roman" w:eastAsia="Calibri" w:hAnsi="Times New Roman" w:cs="Times New Roman"/>
           <w:sz w:val="24"/>
           <w:szCs w:val="24"/>
         </w:rPr>
       </w:pPr>
-    </w:p>
-    <w:p>
-      <w:pPr>
-        <w:jc w:val="center"/>
+      <w:r>
         <w:rPr>
           <w:rFonts w:ascii="Times New Roman" w:eastAsia="Calibri" w:hAnsi="Times New Roman" w:cs="Times New Roman"/>
           <w:sz w:val="24"/>
           <w:szCs w:val="24"/>
         </w:rPr>
-      </w:pPr>
+        <w:t>Москва, 202</w:t>
+      </w:r>
       <w:r>
         <w:rPr>
           <w:rFonts w:ascii="Times New Roman" w:eastAsia="Calibri" w:hAnsi="Times New Roman" w:cs="Times New Roman"/>
           <w:sz w:val="24"/>
           <w:szCs w:val="24"/>
         </w:rPr>
-        <w:t>Москва, 202</w:t>
-      </w:r>
-      <w:r>
-        <w:rPr>
-          <w:rFonts w:ascii="Times New Roman" w:eastAsia="Calibri" w:hAnsi="Times New Roman" w:cs="Times New Roman"/>
-          <w:sz w:val="24"/>
-          <w:szCs w:val="24"/>
-        </w:rPr>
         <w:t>6</w:t>
       </w:r>
     </w:p>
@@ -593,63 +581,25 @@
           <w:sz w:val="28"/>
           <w:szCs w:val="28"/>
         </w:rPr>
-        <w:t xml:space="preserve">создать простой REST сервис (без GUI) и написать к нему тесты (желательно воспользоваться встроенным в фреймворк инструментами, либо </w:t>
-      </w:r>
-      <w:proofErr w:type="spellStart"/>
+        <w:t>создать простой REST сервис (без GUI) и написать к нему тесты (желательно воспользоваться встроенным в фреймворк инструментами, либо pytest + requests, что не очень правильно).</w:t>
+      </w:r>
       <w:r>
         <w:rPr>
           <w:rFonts w:ascii="Times New Roman" w:hAnsi="Times New Roman" w:cs="Times New Roman"/>
           <w:sz w:val="28"/>
           <w:szCs w:val="28"/>
         </w:rPr>
-        <w:t>pytest</w:t>
-      </w:r>
-      <w:proofErr w:type="spellEnd"/>
+        <w:t xml:space="preserve"> По варианту №1 необходимо реализовать работу калькулятора через </w:t>
+      </w:r>
       <w:r>
         <w:rPr>
           <w:rFonts w:ascii="Times New Roman" w:hAnsi="Times New Roman" w:cs="Times New Roman"/>
           <w:sz w:val="28"/>
           <w:szCs w:val="28"/>
-        </w:rPr>
-        <w:t xml:space="preserve"> + </w:t>
-      </w:r>
-      <w:proofErr w:type="spellStart"/>
-      <w:r>
-        <w:rPr>
-          <w:rFonts w:ascii="Times New Roman" w:hAnsi="Times New Roman" w:cs="Times New Roman"/>
-          <w:sz w:val="28"/>
-          <w:szCs w:val="28"/>
-        </w:rPr>
-        <w:t>requests</w:t>
-      </w:r>
-      <w:proofErr w:type="spellEnd"/>
-      <w:r>
-        <w:rPr>
-          <w:rFonts w:ascii="Times New Roman" w:hAnsi="Times New Roman" w:cs="Times New Roman"/>
-          <w:sz w:val="28"/>
-          <w:szCs w:val="28"/>
-        </w:rPr>
-        <w:t>, что не очень правильно).</w:t>
-      </w:r>
-      <w:r>
-        <w:rPr>
-          <w:rFonts w:ascii="Times New Roman" w:hAnsi="Times New Roman" w:cs="Times New Roman"/>
-          <w:sz w:val="28"/>
-          <w:szCs w:val="28"/>
-        </w:rPr>
-        <w:t xml:space="preserve"> По варианту №1 необходимо реализовать работу калькулятора через </w:t>
-      </w:r>
-      <w:proofErr w:type="spellStart"/>
-      <w:r>
-        <w:rPr>
-          <w:rFonts w:ascii="Times New Roman" w:hAnsi="Times New Roman" w:cs="Times New Roman"/>
-          <w:sz w:val="28"/>
-          <w:szCs w:val="28"/>
           <w:lang w:val="en-US"/>
         </w:rPr>
         <w:t>FastAPI</w:t>
       </w:r>
-      <w:proofErr w:type="spellEnd"/>
       <w:r>
         <w:rPr>
           <w:rFonts w:ascii="Times New Roman" w:hAnsi="Times New Roman" w:cs="Times New Roman"/>
@@ -699,16 +649,32 @@
           <w:rFonts w:ascii="Times New Roman" w:hAnsi="Times New Roman" w:cs="Times New Roman"/>
           <w:sz w:val="28"/>
           <w:szCs w:val="28"/>
+        </w:rPr>
+      </w:pPr>
+      <w:r>
+        <w:rPr>
+          <w:rFonts w:ascii="Times New Roman" w:hAnsi="Times New Roman" w:cs="Times New Roman"/>
+          <w:sz w:val="28"/>
+          <w:szCs w:val="28"/>
+        </w:rPr>
+        <w:t xml:space="preserve">Создал </w:t>
+      </w:r>
+      <w:r>
+        <w:rPr>
+          <w:rFonts w:ascii="Times New Roman" w:hAnsi="Times New Roman" w:cs="Times New Roman"/>
+          <w:sz w:val="28"/>
+          <w:szCs w:val="28"/>
           <w:lang w:val="en-US"/>
         </w:rPr>
-      </w:pPr>
+        <w:t>main</w:t>
+      </w:r>
       <w:r>
         <w:rPr>
           <w:rFonts w:ascii="Times New Roman" w:hAnsi="Times New Roman" w:cs="Times New Roman"/>
           <w:sz w:val="28"/>
           <w:szCs w:val="28"/>
         </w:rPr>
-        <w:t xml:space="preserve">Создал </w:t>
+        <w:t>.</w:t>
       </w:r>
       <w:r>
         <w:rPr>
@@ -717,7 +683,7 @@
           <w:szCs w:val="28"/>
           <w:lang w:val="en-US"/>
         </w:rPr>
-        <w:t>main</w:t>
+        <w:t>py</w:t>
       </w:r>
       <w:r>
         <w:rPr>
@@ -725,46 +691,25 @@
           <w:sz w:val="28"/>
           <w:szCs w:val="28"/>
         </w:rPr>
-        <w:t>.</w:t>
-      </w:r>
-      <w:proofErr w:type="spellStart"/>
+        <w:t xml:space="preserve"> </w:t>
+      </w:r>
       <w:r>
         <w:rPr>
           <w:rFonts w:ascii="Times New Roman" w:hAnsi="Times New Roman" w:cs="Times New Roman"/>
           <w:sz w:val="28"/>
           <w:szCs w:val="28"/>
+        </w:rPr>
+        <w:t xml:space="preserve">с реализацией базовых функций калькулятора на </w:t>
+      </w:r>
+      <w:r>
+        <w:rPr>
+          <w:rFonts w:ascii="Times New Roman" w:hAnsi="Times New Roman" w:cs="Times New Roman"/>
+          <w:sz w:val="28"/>
+          <w:szCs w:val="28"/>
           <w:lang w:val="en-US"/>
         </w:rPr>
-        <w:t>py</w:t>
-      </w:r>
-      <w:proofErr w:type="spellEnd"/>
-      <w:r>
-        <w:rPr>
-          <w:rFonts w:ascii="Times New Roman" w:hAnsi="Times New Roman" w:cs="Times New Roman"/>
-          <w:sz w:val="28"/>
-          <w:szCs w:val="28"/>
-        </w:rPr>
-        <w:t xml:space="preserve"> </w:t>
-      </w:r>
-      <w:r>
-        <w:rPr>
-          <w:rFonts w:ascii="Times New Roman" w:hAnsi="Times New Roman" w:cs="Times New Roman"/>
-          <w:sz w:val="28"/>
-          <w:szCs w:val="28"/>
-        </w:rPr>
-        <w:t xml:space="preserve">с реализацией базовых функций калькулятора на </w:t>
-      </w:r>
-      <w:proofErr w:type="spellStart"/>
-      <w:r>
-        <w:rPr>
-          <w:rFonts w:ascii="Times New Roman" w:hAnsi="Times New Roman" w:cs="Times New Roman"/>
-          <w:sz w:val="28"/>
-          <w:szCs w:val="28"/>
-          <w:lang w:val="en-US"/>
-        </w:rPr>
         <w:t>FastAPI</w:t>
       </w:r>
-      <w:proofErr w:type="spellEnd"/>
       <w:r>
         <w:rPr>
           <w:rFonts w:ascii="Times New Roman" w:hAnsi="Times New Roman" w:cs="Times New Roman"/>
@@ -812,7 +757,6 @@
         </w:rPr>
         <w:t xml:space="preserve"> </w:t>
       </w:r>
-      <w:proofErr w:type="spellStart"/>
       <w:r>
         <w:rPr>
           <w:rFonts w:ascii="Consolas" w:eastAsia="Times New Roman" w:hAnsi="Consolas" w:cs="Times New Roman"/>
@@ -825,7 +769,6 @@
         </w:rPr>
         <w:t>fastapi</w:t>
       </w:r>
-      <w:proofErr w:type="spellEnd"/>
       <w:r>
         <w:rPr>
           <w:rFonts w:ascii="Consolas" w:eastAsia="Times New Roman" w:hAnsi="Consolas" w:cs="Times New Roman"/>
@@ -862,7 +805,6 @@
         </w:rPr>
         <w:t xml:space="preserve"> </w:t>
       </w:r>
-      <w:proofErr w:type="spellStart"/>
       <w:r>
         <w:rPr>
           <w:rFonts w:ascii="Consolas" w:eastAsia="Times New Roman" w:hAnsi="Consolas" w:cs="Times New Roman"/>
@@ -875,7 +817,6 @@
         </w:rPr>
         <w:t>FastAPI</w:t>
       </w:r>
-      <w:proofErr w:type="spellEnd"/>
       <w:r>
         <w:rPr>
           <w:rFonts w:ascii="Consolas" w:eastAsia="Times New Roman" w:hAnsi="Consolas" w:cs="Times New Roman"/>
@@ -888,7 +829,6 @@
         </w:rPr>
         <w:t xml:space="preserve">, </w:t>
       </w:r>
-      <w:proofErr w:type="spellStart"/>
       <w:r>
         <w:rPr>
           <w:rFonts w:ascii="Consolas" w:eastAsia="Times New Roman" w:hAnsi="Consolas" w:cs="Times New Roman"/>
@@ -901,7 +841,6 @@
         </w:rPr>
         <w:t>HTTPException</w:t>
       </w:r>
-      <w:proofErr w:type="spellEnd"/>
     </w:p>
     <w:p>
       <w:pPr>
@@ -980,7 +919,6 @@
         </w:rPr>
         <w:t xml:space="preserve"> </w:t>
       </w:r>
-      <w:proofErr w:type="spellStart"/>
       <w:r>
         <w:rPr>
           <w:rFonts w:ascii="Consolas" w:eastAsia="Times New Roman" w:hAnsi="Consolas" w:cs="Times New Roman"/>
@@ -993,7 +931,6 @@
         </w:rPr>
         <w:t>FastAPI</w:t>
       </w:r>
-      <w:proofErr w:type="spellEnd"/>
       <w:r>
         <w:rPr>
           <w:rFonts w:ascii="Consolas" w:eastAsia="Times New Roman" w:hAnsi="Consolas" w:cs="Times New Roman"/>
@@ -2857,7 +2794,6 @@
         </w:rPr>
         <w:t xml:space="preserve"> </w:t>
       </w:r>
-      <w:proofErr w:type="spellStart"/>
       <w:r>
         <w:rPr>
           <w:rFonts w:ascii="Consolas" w:eastAsia="Times New Roman" w:hAnsi="Consolas" w:cs="Times New Roman"/>
@@ -2870,7 +2806,6 @@
         </w:rPr>
         <w:t>HTTPException</w:t>
       </w:r>
-      <w:proofErr w:type="spellEnd"/>
       <w:r>
         <w:rPr>
           <w:rFonts w:ascii="Consolas" w:eastAsia="Times New Roman" w:hAnsi="Consolas" w:cs="Times New Roman"/>
@@ -2883,7 +2818,6 @@
         </w:rPr>
         <w:t>(</w:t>
       </w:r>
-      <w:proofErr w:type="spellStart"/>
       <w:r>
         <w:rPr>
           <w:rFonts w:ascii="Consolas" w:eastAsia="Times New Roman" w:hAnsi="Consolas" w:cs="Times New Roman"/>
@@ -2896,7 +2830,6 @@
         </w:rPr>
         <w:t>status_code</w:t>
       </w:r>
-      <w:proofErr w:type="spellEnd"/>
       <w:r>
         <w:rPr>
           <w:rFonts w:ascii="Consolas" w:eastAsia="Times New Roman" w:hAnsi="Consolas" w:cs="Times New Roman"/>
@@ -2967,7 +2900,7 @@
           <w:lang w:val="en-US" w:eastAsia="ru-RU"/>
           <w14:ligatures w14:val="none"/>
         </w:rPr>
-        <w:t>"Division by zero is not allowed."</w:t>
+        <w:t>"Division by zero is not allowed"</w:t>
       </w:r>
       <w:r>
         <w:rPr>
@@ -3240,7 +3173,6 @@
         </w:rPr>
         <w:t>.</w:t>
       </w:r>
-      <w:proofErr w:type="spellStart"/>
       <w:r>
         <w:rPr>
           <w:rFonts w:ascii="Times New Roman" w:hAnsi="Times New Roman" w:cs="Times New Roman"/>
@@ -3250,7 +3182,6 @@
         </w:rPr>
         <w:t>py</w:t>
       </w:r>
-      <w:proofErr w:type="spellEnd"/>
       <w:r>
         <w:rPr>
           <w:rFonts w:ascii="Times New Roman" w:hAnsi="Times New Roman" w:cs="Times New Roman"/>
@@ -3304,33 +3235,7 @@
           <w:lang w:val="en-US" w:eastAsia="ru-RU"/>
           <w14:ligatures w14:val="none"/>
         </w:rPr>
-        <w:t xml:space="preserve"> </w:t>
-      </w:r>
-      <w:proofErr w:type="spellStart"/>
-      <w:r>
-        <w:rPr>
-          <w:rFonts w:ascii="Consolas" w:eastAsia="Times New Roman" w:hAnsi="Consolas" w:cs="Times New Roman"/>
-          <w:color w:val="BBBEBF"/>
-          <w:kern w:val="0"/>
-          <w:sz w:val="21"/>
-          <w:szCs w:val="21"/>
-          <w:lang w:val="en-US" w:eastAsia="ru-RU"/>
-          <w14:ligatures w14:val="none"/>
-        </w:rPr>
-        <w:t>fastapi.testclient</w:t>
-      </w:r>
-      <w:proofErr w:type="spellEnd"/>
-      <w:r>
-        <w:rPr>
-          <w:rFonts w:ascii="Consolas" w:eastAsia="Times New Roman" w:hAnsi="Consolas" w:cs="Times New Roman"/>
-          <w:color w:val="BBBEBF"/>
-          <w:kern w:val="0"/>
-          <w:sz w:val="21"/>
-          <w:szCs w:val="21"/>
-          <w:lang w:val="en-US" w:eastAsia="ru-RU"/>
-          <w14:ligatures w14:val="none"/>
-        </w:rPr>
-        <w:t xml:space="preserve"> </w:t>
+        <w:t xml:space="preserve"> fastapi.testclient </w:t>
       </w:r>
       <w:r>
         <w:rPr>
@@ -3354,22 +3259,8 @@
           <w:lang w:val="en-US" w:eastAsia="ru-RU"/>
           <w14:ligatures w14:val="none"/>
         </w:rPr>
-        <w:t xml:space="preserve"> </w:t>
-      </w:r>
-      <w:proofErr w:type="spellStart"/>
-      <w:r>
-        <w:rPr>
-          <w:rFonts w:ascii="Consolas" w:eastAsia="Times New Roman" w:hAnsi="Consolas" w:cs="Times New Roman"/>
-          <w:color w:val="BBBEBF"/>
-          <w:kern w:val="0"/>
-          <w:sz w:val="21"/>
-          <w:szCs w:val="21"/>
-          <w:lang w:val="en-US" w:eastAsia="ru-RU"/>
-          <w14:ligatures w14:val="none"/>
-        </w:rPr>
-        <w:t>TestClient</w:t>
-      </w:r>
-      <w:proofErr w:type="spellEnd"/>
+        <w:t xml:space="preserve"> TestClient</w:t>
+      </w:r>
     </w:p>
     <w:p>
       <w:pPr>
@@ -3545,33 +3436,7 @@
           <w:lang w:val="en-US" w:eastAsia="ru-RU"/>
           <w14:ligatures w14:val="none"/>
         </w:rPr>
-        <w:t xml:space="preserve"> </w:t>
-      </w:r>
-      <w:proofErr w:type="spellStart"/>
-      <w:r>
-        <w:rPr>
-          <w:rFonts w:ascii="Consolas" w:eastAsia="Times New Roman" w:hAnsi="Consolas" w:cs="Times New Roman"/>
-          <w:color w:val="BBBEBF"/>
-          <w:kern w:val="0"/>
-          <w:sz w:val="21"/>
-          <w:szCs w:val="21"/>
-          <w:lang w:val="en-US" w:eastAsia="ru-RU"/>
-          <w14:ligatures w14:val="none"/>
-        </w:rPr>
-        <w:t>TestClient</w:t>
-      </w:r>
-      <w:proofErr w:type="spellEnd"/>
-      <w:r>
-        <w:rPr>
-          <w:rFonts w:ascii="Consolas" w:eastAsia="Times New Roman" w:hAnsi="Consolas" w:cs="Times New Roman"/>
-          <w:color w:val="BBBEBF"/>
-          <w:kern w:val="0"/>
-          <w:sz w:val="21"/>
-          <w:szCs w:val="21"/>
-          <w:lang w:val="en-US" w:eastAsia="ru-RU"/>
-          <w14:ligatures w14:val="none"/>
-        </w:rPr>
-        <w:t>(</w:t>
+        <w:t xml:space="preserve"> TestClient(</w:t>
       </w:r>
       <w:r>
         <w:rPr>
@@ -3651,7 +3516,6 @@
         </w:rPr>
         <w:t xml:space="preserve"> </w:t>
       </w:r>
-      <w:proofErr w:type="spellStart"/>
       <w:r>
         <w:rPr>
           <w:rFonts w:ascii="Consolas" w:eastAsia="Times New Roman" w:hAnsi="Consolas" w:cs="Times New Roman"/>
@@ -3664,7 +3528,6 @@
         </w:rPr>
         <w:t>test_add</w:t>
       </w:r>
-      <w:proofErr w:type="spellEnd"/>
       <w:r>
         <w:rPr>
           <w:rFonts w:ascii="Consolas" w:eastAsia="Times New Roman" w:hAnsi="Consolas" w:cs="Times New Roman"/>
@@ -3752,7 +3615,6 @@
         </w:rPr>
         <w:t xml:space="preserve"> </w:t>
       </w:r>
-      <w:proofErr w:type="spellStart"/>
       <w:r>
         <w:rPr>
           <w:rFonts w:ascii="Consolas" w:eastAsia="Times New Roman" w:hAnsi="Consolas" w:cs="Times New Roman"/>
@@ -3775,20 +3637,7 @@
           <w:lang w:val="en-US" w:eastAsia="ru-RU"/>
           <w14:ligatures w14:val="none"/>
         </w:rPr>
-        <w:t>.get</w:t>
-      </w:r>
-      <w:proofErr w:type="spellEnd"/>
-      <w:r>
-        <w:rPr>
-          <w:rFonts w:ascii="Consolas" w:eastAsia="Times New Roman" w:hAnsi="Consolas" w:cs="Times New Roman"/>
-          <w:color w:val="BBBEBF"/>
-          <w:kern w:val="0"/>
-          <w:sz w:val="21"/>
-          <w:szCs w:val="21"/>
-          <w:lang w:val="en-US" w:eastAsia="ru-RU"/>
-          <w14:ligatures w14:val="none"/>
-        </w:rPr>
-        <w:t>(</w:t>
+        <w:t>.get(</w:t>
       </w:r>
       <w:r>
         <w:rPr>
@@ -3800,33 +3649,7 @@
           <w:lang w:val="en-US" w:eastAsia="ru-RU"/>
           <w14:ligatures w14:val="none"/>
         </w:rPr>
-        <w:t>"/</w:t>
-      </w:r>
-      <w:proofErr w:type="spellStart"/>
-      <w:r>
-        <w:rPr>
-          <w:rFonts w:ascii="Consolas" w:eastAsia="Times New Roman" w:hAnsi="Consolas" w:cs="Times New Roman"/>
-          <w:color w:val="A5D6FF"/>
-          <w:kern w:val="0"/>
-          <w:sz w:val="21"/>
-          <w:szCs w:val="21"/>
-          <w:lang w:val="en-US" w:eastAsia="ru-RU"/>
-          <w14:ligatures w14:val="none"/>
-        </w:rPr>
-        <w:t>add?a</w:t>
-      </w:r>
-      <w:proofErr w:type="spellEnd"/>
-      <w:r>
-        <w:rPr>
-          <w:rFonts w:ascii="Consolas" w:eastAsia="Times New Roman" w:hAnsi="Consolas" w:cs="Times New Roman"/>
-          <w:color w:val="A5D6FF"/>
-          <w:kern w:val="0"/>
-          <w:sz w:val="21"/>
-          <w:szCs w:val="21"/>
-          <w:lang w:val="en-US" w:eastAsia="ru-RU"/>
-          <w14:ligatures w14:val="none"/>
-        </w:rPr>
-        <w:t>=10&amp;b=5"</w:t>
+        <w:t>"/add?a=10&amp;b=5"</w:t>
       </w:r>
       <w:r>
         <w:rPr>
@@ -3891,7 +3714,6 @@
         </w:rPr>
         <w:t xml:space="preserve"> </w:t>
       </w:r>
-      <w:proofErr w:type="spellStart"/>
       <w:r>
         <w:rPr>
           <w:rFonts w:ascii="Consolas" w:eastAsia="Times New Roman" w:hAnsi="Consolas" w:cs="Times New Roman"/>
@@ -3914,20 +3736,7 @@
           <w:lang w:val="en-US" w:eastAsia="ru-RU"/>
           <w14:ligatures w14:val="none"/>
         </w:rPr>
-        <w:t>.status_code</w:t>
-      </w:r>
-      <w:proofErr w:type="spellEnd"/>
-      <w:r>
-        <w:rPr>
-          <w:rFonts w:ascii="Consolas" w:eastAsia="Times New Roman" w:hAnsi="Consolas" w:cs="Times New Roman"/>
-          <w:color w:val="BBBEBF"/>
-          <w:kern w:val="0"/>
-          <w:sz w:val="21"/>
-          <w:szCs w:val="21"/>
-          <w:lang w:val="en-US" w:eastAsia="ru-RU"/>
-          <w14:ligatures w14:val="none"/>
-        </w:rPr>
-        <w:t xml:space="preserve"> </w:t>
+        <w:t xml:space="preserve">.status_code </w:t>
       </w:r>
       <w:r>
         <w:rPr>
@@ -4016,7 +3825,6 @@
         </w:rPr>
         <w:t xml:space="preserve"> </w:t>
       </w:r>
-      <w:proofErr w:type="spellStart"/>
       <w:r>
         <w:rPr>
           <w:rFonts w:ascii="Consolas" w:eastAsia="Times New Roman" w:hAnsi="Consolas" w:cs="Times New Roman"/>
@@ -4039,20 +3847,7 @@
           <w:lang w:val="en-US" w:eastAsia="ru-RU"/>
           <w14:ligatures w14:val="none"/>
         </w:rPr>
-        <w:t>.json</w:t>
-      </w:r>
-      <w:proofErr w:type="spellEnd"/>
-      <w:r>
-        <w:rPr>
-          <w:rFonts w:ascii="Consolas" w:eastAsia="Times New Roman" w:hAnsi="Consolas" w:cs="Times New Roman"/>
-          <w:color w:val="BBBEBF"/>
-          <w:kern w:val="0"/>
-          <w:sz w:val="21"/>
-          <w:szCs w:val="21"/>
-          <w:lang w:val="en-US" w:eastAsia="ru-RU"/>
-          <w14:ligatures w14:val="none"/>
-        </w:rPr>
-        <w:t xml:space="preserve">() </w:t>
+        <w:t xml:space="preserve">.json() </w:t>
       </w:r>
       <w:r>
         <w:rPr>
@@ -4228,7 +4023,6 @@
         </w:rPr>
         <w:t xml:space="preserve"> </w:t>
       </w:r>
-      <w:proofErr w:type="spellStart"/>
       <w:r>
         <w:rPr>
           <w:rFonts w:ascii="Consolas" w:eastAsia="Times New Roman" w:hAnsi="Consolas" w:cs="Times New Roman"/>
@@ -4241,7 +4035,6 @@
         </w:rPr>
         <w:t>test_subtract</w:t>
       </w:r>
-      <w:proofErr w:type="spellEnd"/>
       <w:r>
         <w:rPr>
           <w:rFonts w:ascii="Consolas" w:eastAsia="Times New Roman" w:hAnsi="Consolas" w:cs="Times New Roman"/>
@@ -4329,7 +4122,6 @@
         </w:rPr>
         <w:t xml:space="preserve"> </w:t>
       </w:r>
-      <w:proofErr w:type="spellStart"/>
       <w:r>
         <w:rPr>
           <w:rFonts w:ascii="Consolas" w:eastAsia="Times New Roman" w:hAnsi="Consolas" w:cs="Times New Roman"/>
@@ -4352,20 +4144,7 @@
           <w:lang w:val="en-US" w:eastAsia="ru-RU"/>
           <w14:ligatures w14:val="none"/>
         </w:rPr>
-        <w:t>.get</w:t>
-      </w:r>
-      <w:proofErr w:type="spellEnd"/>
-      <w:r>
-        <w:rPr>
-          <w:rFonts w:ascii="Consolas" w:eastAsia="Times New Roman" w:hAnsi="Consolas" w:cs="Times New Roman"/>
-          <w:color w:val="BBBEBF"/>
-          <w:kern w:val="0"/>
-          <w:sz w:val="21"/>
-          <w:szCs w:val="21"/>
-          <w:lang w:val="en-US" w:eastAsia="ru-RU"/>
-          <w14:ligatures w14:val="none"/>
-        </w:rPr>
-        <w:t>(</w:t>
+        <w:t>.get(</w:t>
       </w:r>
       <w:r>
         <w:rPr>
@@ -4377,33 +4156,7 @@
           <w:lang w:val="en-US" w:eastAsia="ru-RU"/>
           <w14:ligatures w14:val="none"/>
         </w:rPr>
-        <w:t>"/</w:t>
-      </w:r>
-      <w:proofErr w:type="spellStart"/>
-      <w:r>
-        <w:rPr>
-          <w:rFonts w:ascii="Consolas" w:eastAsia="Times New Roman" w:hAnsi="Consolas" w:cs="Times New Roman"/>
-          <w:color w:val="A5D6FF"/>
-          <w:kern w:val="0"/>
-          <w:sz w:val="21"/>
-          <w:szCs w:val="21"/>
-          <w:lang w:val="en-US" w:eastAsia="ru-RU"/>
-          <w14:ligatures w14:val="none"/>
-        </w:rPr>
-        <w:t>subtract?a</w:t>
-      </w:r>
-      <w:proofErr w:type="spellEnd"/>
-      <w:r>
-        <w:rPr>
-          <w:rFonts w:ascii="Consolas" w:eastAsia="Times New Roman" w:hAnsi="Consolas" w:cs="Times New Roman"/>
-          <w:color w:val="A5D6FF"/>
-          <w:kern w:val="0"/>
-          <w:sz w:val="21"/>
-          <w:szCs w:val="21"/>
-          <w:lang w:val="en-US" w:eastAsia="ru-RU"/>
-          <w14:ligatures w14:val="none"/>
-        </w:rPr>
-        <w:t>=10&amp;b=5"</w:t>
+        <w:t>"/subtract?a=10&amp;b=5"</w:t>
       </w:r>
       <w:r>
         <w:rPr>
@@ -4468,7 +4221,6 @@
         </w:rPr>
         <w:t xml:space="preserve"> </w:t>
       </w:r>
-      <w:proofErr w:type="spellStart"/>
       <w:r>
         <w:rPr>
           <w:rFonts w:ascii="Consolas" w:eastAsia="Times New Roman" w:hAnsi="Consolas" w:cs="Times New Roman"/>
@@ -4491,20 +4243,7 @@
           <w:lang w:val="en-US" w:eastAsia="ru-RU"/>
           <w14:ligatures w14:val="none"/>
         </w:rPr>
-        <w:t>.status_code</w:t>
-      </w:r>
-      <w:proofErr w:type="spellEnd"/>
-      <w:r>
-        <w:rPr>
-          <w:rFonts w:ascii="Consolas" w:eastAsia="Times New Roman" w:hAnsi="Consolas" w:cs="Times New Roman"/>
-          <w:color w:val="BBBEBF"/>
-          <w:kern w:val="0"/>
-          <w:sz w:val="21"/>
-          <w:szCs w:val="21"/>
-          <w:lang w:val="en-US" w:eastAsia="ru-RU"/>
-          <w14:ligatures w14:val="none"/>
-        </w:rPr>
-        <w:t xml:space="preserve"> </w:t>
+        <w:t xml:space="preserve">.status_code </w:t>
       </w:r>
       <w:r>
         <w:rPr>
@@ -4594,7 +4333,6 @@
         </w:rPr>
         <w:t xml:space="preserve"> </w:t>
       </w:r>
-      <w:proofErr w:type="spellStart"/>
       <w:r>
         <w:rPr>
           <w:rFonts w:ascii="Consolas" w:eastAsia="Times New Roman" w:hAnsi="Consolas" w:cs="Times New Roman"/>
@@ -4617,20 +4355,7 @@
           <w:lang w:val="en-US" w:eastAsia="ru-RU"/>
           <w14:ligatures w14:val="none"/>
         </w:rPr>
-        <w:t>.json</w:t>
-      </w:r>
-      <w:proofErr w:type="spellEnd"/>
-      <w:r>
-        <w:rPr>
-          <w:rFonts w:ascii="Consolas" w:eastAsia="Times New Roman" w:hAnsi="Consolas" w:cs="Times New Roman"/>
-          <w:color w:val="BBBEBF"/>
-          <w:kern w:val="0"/>
-          <w:sz w:val="21"/>
-          <w:szCs w:val="21"/>
-          <w:lang w:val="en-US" w:eastAsia="ru-RU"/>
-          <w14:ligatures w14:val="none"/>
-        </w:rPr>
-        <w:t xml:space="preserve">() </w:t>
+        <w:t xml:space="preserve">.json() </w:t>
       </w:r>
       <w:r>
         <w:rPr>
@@ -4806,7 +4531,6 @@
         </w:rPr>
         <w:t xml:space="preserve"> </w:t>
       </w:r>
-      <w:proofErr w:type="spellStart"/>
       <w:r>
         <w:rPr>
           <w:rFonts w:ascii="Consolas" w:eastAsia="Times New Roman" w:hAnsi="Consolas" w:cs="Times New Roman"/>
@@ -4819,7 +4543,6 @@
         </w:rPr>
         <w:t>test_multiply</w:t>
       </w:r>
-      <w:proofErr w:type="spellEnd"/>
       <w:r>
         <w:rPr>
           <w:rFonts w:ascii="Consolas" w:eastAsia="Times New Roman" w:hAnsi="Consolas" w:cs="Times New Roman"/>
@@ -4907,7 +4630,6 @@
         </w:rPr>
         <w:t xml:space="preserve"> </w:t>
       </w:r>
-      <w:proofErr w:type="spellStart"/>
       <w:r>
         <w:rPr>
           <w:rFonts w:ascii="Consolas" w:eastAsia="Times New Roman" w:hAnsi="Consolas" w:cs="Times New Roman"/>
@@ -4930,20 +4652,7 @@
           <w:lang w:val="en-US" w:eastAsia="ru-RU"/>
           <w14:ligatures w14:val="none"/>
         </w:rPr>
-        <w:t>.get</w:t>
-      </w:r>
-      <w:proofErr w:type="spellEnd"/>
-      <w:r>
-        <w:rPr>
-          <w:rFonts w:ascii="Consolas" w:eastAsia="Times New Roman" w:hAnsi="Consolas" w:cs="Times New Roman"/>
-          <w:color w:val="BBBEBF"/>
-          <w:kern w:val="0"/>
-          <w:sz w:val="21"/>
-          <w:szCs w:val="21"/>
-          <w:lang w:val="en-US" w:eastAsia="ru-RU"/>
-          <w14:ligatures w14:val="none"/>
-        </w:rPr>
-        <w:t>(</w:t>
+        <w:t>.get(</w:t>
       </w:r>
       <w:r>
         <w:rPr>
@@ -4955,33 +4664,7 @@
           <w:lang w:val="en-US" w:eastAsia="ru-RU"/>
           <w14:ligatures w14:val="none"/>
         </w:rPr>
-        <w:t>"/</w:t>
-      </w:r>
-      <w:proofErr w:type="spellStart"/>
-      <w:r>
-        <w:rPr>
-          <w:rFonts w:ascii="Consolas" w:eastAsia="Times New Roman" w:hAnsi="Consolas" w:cs="Times New Roman"/>
-          <w:color w:val="A5D6FF"/>
-          <w:kern w:val="0"/>
-          <w:sz w:val="21"/>
-          <w:szCs w:val="21"/>
-          <w:lang w:val="en-US" w:eastAsia="ru-RU"/>
-          <w14:ligatures w14:val="none"/>
-        </w:rPr>
-        <w:t>multiply?a</w:t>
-      </w:r>
-      <w:proofErr w:type="spellEnd"/>
-      <w:r>
-        <w:rPr>
-          <w:rFonts w:ascii="Consolas" w:eastAsia="Times New Roman" w:hAnsi="Consolas" w:cs="Times New Roman"/>
-          <w:color w:val="A5D6FF"/>
-          <w:kern w:val="0"/>
-          <w:sz w:val="21"/>
-          <w:szCs w:val="21"/>
-          <w:lang w:val="en-US" w:eastAsia="ru-RU"/>
-          <w14:ligatures w14:val="none"/>
-        </w:rPr>
-        <w:t>=10&amp;b=5"</w:t>
+        <w:t>"/multiply?a=10&amp;b=5"</w:t>
       </w:r>
       <w:r>
         <w:rPr>
@@ -5046,7 +4729,6 @@
         </w:rPr>
         <w:t xml:space="preserve"> </w:t>
       </w:r>
-      <w:proofErr w:type="spellStart"/>
       <w:r>
         <w:rPr>
           <w:rFonts w:ascii="Consolas" w:eastAsia="Times New Roman" w:hAnsi="Consolas" w:cs="Times New Roman"/>
@@ -5069,20 +4751,7 @@
           <w:lang w:val="en-US" w:eastAsia="ru-RU"/>
           <w14:ligatures w14:val="none"/>
         </w:rPr>
-        <w:t>.status_code</w:t>
-      </w:r>
-      <w:proofErr w:type="spellEnd"/>
-      <w:r>
-        <w:rPr>
-          <w:rFonts w:ascii="Consolas" w:eastAsia="Times New Roman" w:hAnsi="Consolas" w:cs="Times New Roman"/>
-          <w:color w:val="BBBEBF"/>
-          <w:kern w:val="0"/>
-          <w:sz w:val="21"/>
-          <w:szCs w:val="21"/>
-          <w:lang w:val="en-US" w:eastAsia="ru-RU"/>
-          <w14:ligatures w14:val="none"/>
-        </w:rPr>
-        <w:t xml:space="preserve"> </w:t>
+        <w:t xml:space="preserve">.status_code </w:t>
       </w:r>
       <w:r>
         <w:rPr>
@@ -5171,7 +4840,6 @@
         </w:rPr>
         <w:t xml:space="preserve"> </w:t>
       </w:r>
-      <w:proofErr w:type="spellStart"/>
       <w:r>
         <w:rPr>
           <w:rFonts w:ascii="Consolas" w:eastAsia="Times New Roman" w:hAnsi="Consolas" w:cs="Times New Roman"/>
@@ -5194,20 +4862,7 @@
           <w:lang w:val="en-US" w:eastAsia="ru-RU"/>
           <w14:ligatures w14:val="none"/>
         </w:rPr>
-        <w:t>.json</w:t>
-      </w:r>
-      <w:proofErr w:type="spellEnd"/>
-      <w:r>
-        <w:rPr>
-          <w:rFonts w:ascii="Consolas" w:eastAsia="Times New Roman" w:hAnsi="Consolas" w:cs="Times New Roman"/>
-          <w:color w:val="BBBEBF"/>
-          <w:kern w:val="0"/>
-          <w:sz w:val="21"/>
-          <w:szCs w:val="21"/>
-          <w:lang w:val="en-US" w:eastAsia="ru-RU"/>
-          <w14:ligatures w14:val="none"/>
-        </w:rPr>
-        <w:t xml:space="preserve">() </w:t>
+        <w:t xml:space="preserve">.json() </w:t>
       </w:r>
       <w:r>
         <w:rPr>
@@ -5383,7 +5038,6 @@
         </w:rPr>
         <w:t xml:space="preserve"> </w:t>
       </w:r>
-      <w:proofErr w:type="spellStart"/>
       <w:r>
         <w:rPr>
           <w:rFonts w:ascii="Consolas" w:eastAsia="Times New Roman" w:hAnsi="Consolas" w:cs="Times New Roman"/>
@@ -5396,7 +5050,6 @@
         </w:rPr>
         <w:t>test_divide</w:t>
       </w:r>
-      <w:proofErr w:type="spellEnd"/>
       <w:r>
         <w:rPr>
           <w:rFonts w:ascii="Consolas" w:eastAsia="Times New Roman" w:hAnsi="Consolas" w:cs="Times New Roman"/>
@@ -5484,7 +5137,6 @@
         </w:rPr>
         <w:t xml:space="preserve"> </w:t>
       </w:r>
-      <w:proofErr w:type="spellStart"/>
       <w:r>
         <w:rPr>
           <w:rFonts w:ascii="Consolas" w:eastAsia="Times New Roman" w:hAnsi="Consolas" w:cs="Times New Roman"/>
@@ -5507,20 +5159,7 @@
           <w:lang w:val="en-US" w:eastAsia="ru-RU"/>
           <w14:ligatures w14:val="none"/>
         </w:rPr>
-        <w:t>.get</w:t>
-      </w:r>
-      <w:proofErr w:type="spellEnd"/>
-      <w:r>
-        <w:rPr>
-          <w:rFonts w:ascii="Consolas" w:eastAsia="Times New Roman" w:hAnsi="Consolas" w:cs="Times New Roman"/>
-          <w:color w:val="BBBEBF"/>
-          <w:kern w:val="0"/>
-          <w:sz w:val="21"/>
-          <w:szCs w:val="21"/>
-          <w:lang w:val="en-US" w:eastAsia="ru-RU"/>
-          <w14:ligatures w14:val="none"/>
-        </w:rPr>
-        <w:t>(</w:t>
+        <w:t>.get(</w:t>
       </w:r>
       <w:r>
         <w:rPr>
@@ -5532,33 +5171,7 @@
           <w:lang w:val="en-US" w:eastAsia="ru-RU"/>
           <w14:ligatures w14:val="none"/>
         </w:rPr>
-        <w:t>"/</w:t>
-      </w:r>
-      <w:proofErr w:type="spellStart"/>
-      <w:r>
-        <w:rPr>
-          <w:rFonts w:ascii="Consolas" w:eastAsia="Times New Roman" w:hAnsi="Consolas" w:cs="Times New Roman"/>
-          <w:color w:val="A5D6FF"/>
-          <w:kern w:val="0"/>
-          <w:sz w:val="21"/>
-          <w:szCs w:val="21"/>
-          <w:lang w:val="en-US" w:eastAsia="ru-RU"/>
-          <w14:ligatures w14:val="none"/>
-        </w:rPr>
-        <w:t>divide?a</w:t>
-      </w:r>
-      <w:proofErr w:type="spellEnd"/>
-      <w:r>
-        <w:rPr>
-          <w:rFonts w:ascii="Consolas" w:eastAsia="Times New Roman" w:hAnsi="Consolas" w:cs="Times New Roman"/>
-          <w:color w:val="A5D6FF"/>
-          <w:kern w:val="0"/>
-          <w:sz w:val="21"/>
-          <w:szCs w:val="21"/>
-          <w:lang w:val="en-US" w:eastAsia="ru-RU"/>
-          <w14:ligatures w14:val="none"/>
-        </w:rPr>
-        <w:t>=10&amp;b=5"</w:t>
+        <w:t>"/divide?a=10&amp;b=5"</w:t>
       </w:r>
       <w:r>
         <w:rPr>
@@ -5623,7 +5236,6 @@
         </w:rPr>
         <w:t xml:space="preserve"> </w:t>
       </w:r>
-      <w:proofErr w:type="spellStart"/>
       <w:r>
         <w:rPr>
           <w:rFonts w:ascii="Consolas" w:eastAsia="Times New Roman" w:hAnsi="Consolas" w:cs="Times New Roman"/>
@@ -5646,20 +5258,7 @@
           <w:lang w:val="en-US" w:eastAsia="ru-RU"/>
           <w14:ligatures w14:val="none"/>
         </w:rPr>
-        <w:t>.status_code</w:t>
-      </w:r>
-      <w:proofErr w:type="spellEnd"/>
-      <w:r>
-        <w:rPr>
-          <w:rFonts w:ascii="Consolas" w:eastAsia="Times New Roman" w:hAnsi="Consolas" w:cs="Times New Roman"/>
-          <w:color w:val="BBBEBF"/>
-          <w:kern w:val="0"/>
-          <w:sz w:val="21"/>
-          <w:szCs w:val="21"/>
-          <w:lang w:val="en-US" w:eastAsia="ru-RU"/>
-          <w14:ligatures w14:val="none"/>
-        </w:rPr>
-        <w:t xml:space="preserve"> </w:t>
+        <w:t xml:space="preserve">.status_code </w:t>
       </w:r>
       <w:r>
         <w:rPr>
@@ -5748,7 +5347,6 @@
         </w:rPr>
         <w:t xml:space="preserve"> </w:t>
       </w:r>
-      <w:proofErr w:type="spellStart"/>
       <w:r>
         <w:rPr>
           <w:rFonts w:ascii="Consolas" w:eastAsia="Times New Roman" w:hAnsi="Consolas" w:cs="Times New Roman"/>
@@ -5771,20 +5369,7 @@
           <w:lang w:val="en-US" w:eastAsia="ru-RU"/>
           <w14:ligatures w14:val="none"/>
         </w:rPr>
-        <w:t>.json</w:t>
-      </w:r>
-      <w:proofErr w:type="spellEnd"/>
-      <w:r>
-        <w:rPr>
-          <w:rFonts w:ascii="Consolas" w:eastAsia="Times New Roman" w:hAnsi="Consolas" w:cs="Times New Roman"/>
-          <w:color w:val="BBBEBF"/>
-          <w:kern w:val="0"/>
-          <w:sz w:val="21"/>
-          <w:szCs w:val="21"/>
-          <w:lang w:val="en-US" w:eastAsia="ru-RU"/>
-          <w14:ligatures w14:val="none"/>
-        </w:rPr>
-        <w:t xml:space="preserve">() </w:t>
+        <w:t xml:space="preserve">.json() </w:t>
       </w:r>
       <w:r>
         <w:rPr>
@@ -5960,7 +5545,6 @@
         </w:rPr>
         <w:t xml:space="preserve"> </w:t>
       </w:r>
-      <w:proofErr w:type="spellStart"/>
       <w:r>
         <w:rPr>
           <w:rFonts w:ascii="Consolas" w:eastAsia="Times New Roman" w:hAnsi="Consolas" w:cs="Times New Roman"/>
@@ -5973,7 +5557,6 @@
         </w:rPr>
         <w:t>test_divide_by_zero</w:t>
       </w:r>
-      <w:proofErr w:type="spellEnd"/>
       <w:r>
         <w:rPr>
           <w:rFonts w:ascii="Consolas" w:eastAsia="Times New Roman" w:hAnsi="Consolas" w:cs="Times New Roman"/>
@@ -6061,7 +5644,6 @@
         </w:rPr>
         <w:t xml:space="preserve"> </w:t>
       </w:r>
-      <w:proofErr w:type="spellStart"/>
       <w:r>
         <w:rPr>
           <w:rFonts w:ascii="Consolas" w:eastAsia="Times New Roman" w:hAnsi="Consolas" w:cs="Times New Roman"/>
@@ -6084,20 +5666,7 @@
           <w:lang w:val="en-US" w:eastAsia="ru-RU"/>
           <w14:ligatures w14:val="none"/>
         </w:rPr>
-        <w:t>.get</w:t>
-      </w:r>
-      <w:proofErr w:type="spellEnd"/>
-      <w:r>
-        <w:rPr>
-          <w:rFonts w:ascii="Consolas" w:eastAsia="Times New Roman" w:hAnsi="Consolas" w:cs="Times New Roman"/>
-          <w:color w:val="BBBEBF"/>
-          <w:kern w:val="0"/>
-          <w:sz w:val="21"/>
-          <w:szCs w:val="21"/>
-          <w:lang w:val="en-US" w:eastAsia="ru-RU"/>
-          <w14:ligatures w14:val="none"/>
-        </w:rPr>
-        <w:t>(</w:t>
+        <w:t>.get(</w:t>
       </w:r>
       <w:r>
         <w:rPr>
@@ -6109,33 +5678,7 @@
           <w:lang w:val="en-US" w:eastAsia="ru-RU"/>
           <w14:ligatures w14:val="none"/>
         </w:rPr>
-        <w:t>"/</w:t>
-      </w:r>
-      <w:proofErr w:type="spellStart"/>
-      <w:r>
-        <w:rPr>
-          <w:rFonts w:ascii="Consolas" w:eastAsia="Times New Roman" w:hAnsi="Consolas" w:cs="Times New Roman"/>
-          <w:color w:val="A5D6FF"/>
-          <w:kern w:val="0"/>
-          <w:sz w:val="21"/>
-          <w:szCs w:val="21"/>
-          <w:lang w:val="en-US" w:eastAsia="ru-RU"/>
-          <w14:ligatures w14:val="none"/>
-        </w:rPr>
-        <w:t>divide?a</w:t>
-      </w:r>
-      <w:proofErr w:type="spellEnd"/>
-      <w:r>
-        <w:rPr>
-          <w:rFonts w:ascii="Consolas" w:eastAsia="Times New Roman" w:hAnsi="Consolas" w:cs="Times New Roman"/>
-          <w:color w:val="A5D6FF"/>
-          <w:kern w:val="0"/>
-          <w:sz w:val="21"/>
-          <w:szCs w:val="21"/>
-          <w:lang w:val="en-US" w:eastAsia="ru-RU"/>
-          <w14:ligatures w14:val="none"/>
-        </w:rPr>
-        <w:t>=10&amp;b=0"</w:t>
+        <w:t>"/divide?a=10&amp;b=0"</w:t>
       </w:r>
       <w:r>
         <w:rPr>
@@ -6200,7 +5743,6 @@
         </w:rPr>
         <w:t xml:space="preserve"> </w:t>
       </w:r>
-      <w:proofErr w:type="spellStart"/>
       <w:r>
         <w:rPr>
           <w:rFonts w:ascii="Consolas" w:eastAsia="Times New Roman" w:hAnsi="Consolas" w:cs="Times New Roman"/>
@@ -6223,20 +5765,7 @@
           <w:lang w:val="en-US" w:eastAsia="ru-RU"/>
           <w14:ligatures w14:val="none"/>
         </w:rPr>
-        <w:t>.status_code</w:t>
-      </w:r>
-      <w:proofErr w:type="spellEnd"/>
-      <w:r>
-        <w:rPr>
-          <w:rFonts w:ascii="Consolas" w:eastAsia="Times New Roman" w:hAnsi="Consolas" w:cs="Times New Roman"/>
-          <w:color w:val="BBBEBF"/>
-          <w:kern w:val="0"/>
-          <w:sz w:val="21"/>
-          <w:szCs w:val="21"/>
-          <w:lang w:val="en-US" w:eastAsia="ru-RU"/>
-          <w14:ligatures w14:val="none"/>
-        </w:rPr>
-        <w:t xml:space="preserve"> </w:t>
+        <w:t xml:space="preserve">.status_code </w:t>
       </w:r>
       <w:r>
         <w:rPr>
@@ -6325,7 +5854,6 @@
         </w:rPr>
         <w:t xml:space="preserve"> </w:t>
       </w:r>
-      <w:proofErr w:type="spellStart"/>
       <w:r>
         <w:rPr>
           <w:rFonts w:ascii="Consolas" w:eastAsia="Times New Roman" w:hAnsi="Consolas" w:cs="Times New Roman"/>
@@ -6348,20 +5876,7 @@
           <w:lang w:val="en-US" w:eastAsia="ru-RU"/>
           <w14:ligatures w14:val="none"/>
         </w:rPr>
-        <w:t>.json</w:t>
-      </w:r>
-      <w:proofErr w:type="spellEnd"/>
-      <w:r>
-        <w:rPr>
-          <w:rFonts w:ascii="Consolas" w:eastAsia="Times New Roman" w:hAnsi="Consolas" w:cs="Times New Roman"/>
-          <w:color w:val="BBBEBF"/>
-          <w:kern w:val="0"/>
-          <w:sz w:val="21"/>
-          <w:szCs w:val="21"/>
-          <w:lang w:val="en-US" w:eastAsia="ru-RU"/>
-          <w14:ligatures w14:val="none"/>
-        </w:rPr>
-        <w:t xml:space="preserve">() </w:t>
+        <w:t xml:space="preserve">.json() </w:t>
       </w:r>
       <w:r>
         <w:rPr>
@@ -6445,6 +5960,7 @@
           <w:rFonts w:ascii="Times New Roman" w:hAnsi="Times New Roman" w:cs="Times New Roman"/>
           <w:sz w:val="28"/>
           <w:szCs w:val="28"/>
+          <w:lang w:val="en-US"/>
         </w:rPr>
       </w:pPr>
     </w:p>
@@ -6457,28 +5973,25 @@
           <w:rFonts w:ascii="Times New Roman" w:hAnsi="Times New Roman" w:cs="Times New Roman"/>
           <w:sz w:val="28"/>
           <w:szCs w:val="28"/>
+        </w:rPr>
+      </w:pPr>
+      <w:r>
+        <w:rPr>
+          <w:rFonts w:ascii="Times New Roman" w:hAnsi="Times New Roman" w:cs="Times New Roman"/>
+          <w:sz w:val="28"/>
+          <w:szCs w:val="28"/>
+        </w:rPr>
+        <w:t xml:space="preserve">Проверил функции с помощью </w:t>
+      </w:r>
+      <w:r>
+        <w:rPr>
+          <w:rFonts w:ascii="Times New Roman" w:hAnsi="Times New Roman" w:cs="Times New Roman"/>
+          <w:sz w:val="28"/>
+          <w:szCs w:val="28"/>
           <w:lang w:val="en-US"/>
         </w:rPr>
-      </w:pPr>
-      <w:r>
-        <w:rPr>
-          <w:rFonts w:ascii="Times New Roman" w:hAnsi="Times New Roman" w:cs="Times New Roman"/>
-          <w:sz w:val="28"/>
-          <w:szCs w:val="28"/>
-        </w:rPr>
-        <w:t xml:space="preserve">Проверил функции с помощью </w:t>
-      </w:r>
-      <w:proofErr w:type="spellStart"/>
-      <w:r>
-        <w:rPr>
-          <w:rFonts w:ascii="Times New Roman" w:hAnsi="Times New Roman" w:cs="Times New Roman"/>
-          <w:sz w:val="28"/>
-          <w:szCs w:val="28"/>
-          <w:lang w:val="en-US"/>
-        </w:rPr>
         <w:t>pytest</w:t>
       </w:r>
-      <w:proofErr w:type="spellEnd"/>
       <w:r>
         <w:rPr>
           <w:rFonts w:ascii="Times New Roman" w:hAnsi="Times New Roman" w:cs="Times New Roman"/>
@@ -6661,7 +6174,6 @@
           <w:rFonts w:ascii="Times New Roman" w:hAnsi="Times New Roman" w:cs="Times New Roman"/>
           <w:sz w:val="28"/>
           <w:szCs w:val="28"/>
-          <w:lang w:val="en-US"/>
         </w:rPr>
       </w:pPr>
     </w:p>
@@ -6674,7 +6186,6 @@
           <w:rFonts w:ascii="Times New Roman" w:hAnsi="Times New Roman" w:cs="Times New Roman"/>
           <w:sz w:val="28"/>
           <w:szCs w:val="28"/>
-          <w:lang w:val="en-US"/>
         </w:rPr>
       </w:pPr>
     </w:p>
@@ -6687,7 +6198,6 @@
           <w:rFonts w:ascii="Times New Roman" w:hAnsi="Times New Roman" w:cs="Times New Roman"/>
           <w:sz w:val="28"/>
           <w:szCs w:val="28"/>
-          <w:lang w:val="en-US"/>
         </w:rPr>
       </w:pPr>
     </w:p>
@@ -6700,7 +6210,6 @@
           <w:rFonts w:ascii="Times New Roman" w:hAnsi="Times New Roman" w:cs="Times New Roman"/>
           <w:sz w:val="28"/>
           <w:szCs w:val="28"/>
-          <w:lang w:val="en-US"/>
         </w:rPr>
       </w:pPr>
     </w:p>
@@ -6713,7 +6222,6 @@
           <w:rFonts w:ascii="Times New Roman" w:hAnsi="Times New Roman" w:cs="Times New Roman"/>
           <w:sz w:val="28"/>
           <w:szCs w:val="28"/>
-          <w:lang w:val="en-US"/>
         </w:rPr>
       </w:pPr>
     </w:p>
@@ -6726,7 +6234,6 @@
           <w:rFonts w:ascii="Times New Roman" w:hAnsi="Times New Roman" w:cs="Times New Roman"/>
           <w:sz w:val="28"/>
           <w:szCs w:val="28"/>
-          <w:lang w:val="en-US"/>
         </w:rPr>
       </w:pPr>
     </w:p>
@@ -6739,7 +6246,6 @@
           <w:rFonts w:ascii="Times New Roman" w:hAnsi="Times New Roman" w:cs="Times New Roman"/>
           <w:sz w:val="28"/>
           <w:szCs w:val="28"/>
-          <w:lang w:val="en-US"/>
         </w:rPr>
       </w:pPr>
     </w:p>
@@ -6752,7 +6258,6 @@
           <w:rFonts w:ascii="Times New Roman" w:hAnsi="Times New Roman" w:cs="Times New Roman"/>
           <w:sz w:val="28"/>
           <w:szCs w:val="28"/>
-          <w:lang w:val="en-US"/>
         </w:rPr>
       </w:pPr>
     </w:p>
@@ -6765,7 +6270,6 @@
           <w:rFonts w:ascii="Times New Roman" w:hAnsi="Times New Roman" w:cs="Times New Roman"/>
           <w:sz w:val="28"/>
           <w:szCs w:val="28"/>
-          <w:lang w:val="en-US"/>
         </w:rPr>
       </w:pPr>
       <w:r>
@@ -6777,7 +6281,6 @@
         <w:lastRenderedPageBreak/>
         <w:t xml:space="preserve">Запушил код в </w:t>
       </w:r>
-      <w:proofErr w:type="spellStart"/>
       <w:r>
         <w:rPr>
           <w:rFonts w:ascii="Times New Roman" w:hAnsi="Times New Roman" w:cs="Times New Roman"/>
@@ -6787,13 +6290,11 @@
         </w:rPr>
         <w:t>gitlab</w:t>
       </w:r>
-      <w:proofErr w:type="spellEnd"/>
       <w:r>
         <w:rPr>
           <w:rFonts w:ascii="Times New Roman" w:hAnsi="Times New Roman" w:cs="Times New Roman"/>
           <w:sz w:val="28"/>
           <w:szCs w:val="28"/>
-          <w:lang w:val="en-US"/>
         </w:rPr>
         <w:t>:</w:t>
       </w:r>
@@ -7047,25 +6548,7 @@
           <w:sz w:val="28"/>
           <w:szCs w:val="28"/>
         </w:rPr>
-        <w:t xml:space="preserve"> работу калькулятора через </w:t>
-      </w:r>
-      <w:proofErr w:type="spellStart"/>
-      <w:r>
-        <w:rPr>
-          <w:rFonts w:ascii="Times New Roman" w:hAnsi="Times New Roman" w:cs="Times New Roman"/>
-          <w:sz w:val="28"/>
-          <w:szCs w:val="28"/>
-        </w:rPr>
-        <w:t>FastAPI</w:t>
-      </w:r>
-      <w:proofErr w:type="spellEnd"/>
-      <w:r>
-        <w:rPr>
-          <w:rFonts w:ascii="Times New Roman" w:hAnsi="Times New Roman" w:cs="Times New Roman"/>
-          <w:sz w:val="28"/>
-          <w:szCs w:val="28"/>
-        </w:rPr>
-        <w:t>.</w:t>
+        <w:t xml:space="preserve"> работу калькулятора через FastAPI.</w:t>
       </w:r>
     </w:p>
     <w:sectPr>

</xml_diff>